<commit_message>
RH : gestion commune aux deux sociétés, comme la finance
Décision du gérant : un seul service RH gère dans les mêmes listes et le
même tableau de bord le personnel de toutes les sociétés du compte
(filtre Société facultatif, paramètre company_id des routes). Chaque
société reste l'employeur légal : employeur choisi à l'embauche, une
paie, une déclaration et une écriture par société, préparées ensemble
(POST /rh/payrolls sans société). Départements communs ou d'une société,
responsable hiérarchique de l'une ou l'autre société, références
contrôlées contre l'employeur. Taux, barème, congés, heures, alertes et
comptes communs aux deux sociétés ; numéro d'employeur CNSS, taxe de
formation et journal propres à chacune. Tableau de bord consolidé avec
répartition par société. Société de travail lue dans /rh/meta (la
passerelle ne relaie pas /auth/me). Test ajouté.

Co-Authored-By: Claude Opus 5.5 <noreply@anthropic.com>
</commit_message>
<xml_diff>
--- a/docs/guides/word/Guide_rh.docx
+++ b/docs/guides/word/Guide_rh.docx
@@ -272,7 +272,7 @@
           <w:sz w:val="20"/>
           <w:szCs w:val="20"/>
         </w:rPr>
-        <w:t xml:space="preserve">NIMOVA · RH sert les deux sociétés, chacune avec son personnel et sa paie. Si votre compte est ouvert aux deux, choisissez d'abord la société de travail dans le sélecteur en haut de l'écran.</w:t>
+        <w:t xml:space="preserve">La gestion RH est commune aux deux sociétés, comme la finance : vous voyez et gérez le personnel d'EGUITRA GROUP SARLU et de MB AxisPro dans les mêmes listes et le même tableau de bord (le filtre « Société » restreint l'affichage à l'une d'elles). Chaque société reste l'employeur légal de ses salariés : l'employeur se choisit à l'embauche, et chaque société a sa paie, sa déclaration CNSS, ses impôts sur salaires et son écriture de paie, préparées ensemble chaque mois.</w:t>
       </w:r>
     </w:p>
     <w:p>
@@ -1578,15 +1578,15 @@
           <w:sz w:val="20"/>
           <w:szCs w:val="20"/>
         </w:rPr>
-        <w:t xml:space="preserve">Créer la paie du mois</w:t>
-      </w:r>
-      <w:r>
-        <w:rPr>
-          <w:rFonts w:ascii="Calibri" w:cs="Calibri" w:eastAsia="Calibri" w:hAnsi="Calibri"/>
-          <w:sz w:val="20"/>
-          <w:szCs w:val="20"/>
-        </w:rPr>
-        <w:t xml:space="preserve"> : un bulletin pour chaque salarié sous contrat ce mois-là, avec le prorata des entrées et des sorties, les absences non rémunérées, les échéances d'avances et de prêts, les primes de rotation et les éléments fixes.</w:t>
+        <w:t xml:space="preserve">Préparer la paie du mois</w:t>
+      </w:r>
+      <w:r>
+        <w:rPr>
+          <w:rFonts w:ascii="Calibri" w:cs="Calibri" w:eastAsia="Calibri" w:hAnsi="Calibri"/>
+          <w:sz w:val="20"/>
+          <w:szCs w:val="20"/>
+        </w:rPr>
+        <w:t xml:space="preserve"> : une paie par société, préparées ensemble, avec un bulletin pour chaque salarié sous contrat ce mois-là, le prorata des entrées et des sorties, les absences non rémunérées, les échéances d'avances et de prêts, les primes de rotation et les éléments fixes.</w:t>
       </w:r>
     </w:p>
     <w:p>
@@ -2316,7 +2316,7 @@
           <w:sz w:val="20"/>
           <w:szCs w:val="20"/>
         </w:rPr>
-        <w:t xml:space="preserve">Ces valeurs sont des paramètres de chaque société. </w:t>
+        <w:t xml:space="preserve">Ces valeurs sont communes aux deux sociétés ; le numéro d'employeur CNSS, la taxe de formation et le journal des salaires sont propres à chacune. </w:t>
       </w:r>
       <w:r>
         <w:rPr>

</xml_diff>

<commit_message>
Guide RH (Word) : section Habilitations et sécurité
Co-Authored-By: Claude Opus 5.5 <noreply@anthropic.com>
</commit_message>
<xml_diff>
--- a/docs/guides/word/Guide_rh.docx
+++ b/docs/guides/word/Guide_rh.docx
@@ -11,7 +11,7 @@
           <wp:inline distT="0" distB="0" distL="0" distR="0">
             <wp:extent cx="1428750" cy="476250"/>
             <wp:effectExtent t="0" r="0" b="0" l="0"/>
-            <wp:docPr id="11" name="" descr="" title=""/>
+            <wp:docPr id="1" name="" descr="" title=""/>
             <wp:cNvGraphicFramePr>
               <a:graphicFrameLocks xmlns:a="http://schemas.openxmlformats.org/drawingml/2006/main" noChangeAspect="1"/>
             </wp:cNvGraphicFramePr>
@@ -2346,6 +2346,210 @@
           <w:sz w:val="26"/>
           <w:szCs w:val="26"/>
         </w:rPr>
+        <w:t xml:space="preserve">Habilitations et sécurité</w:t>
+      </w:r>
+    </w:p>
+    <w:p>
+      <w:pPr>
+        <w:spacing w:after="100"/>
+        <w:jc w:val="both"/>
+      </w:pPr>
+      <w:r>
+        <w:rPr>
+          <w:rFonts w:ascii="Calibri" w:cs="Calibri" w:eastAsia="Calibri" w:hAnsi="Calibri"/>
+          <w:sz w:val="20"/>
+          <w:szCs w:val="20"/>
+        </w:rPr>
+        <w:t xml:space="preserve">L'écran « Habilitations et sécurité » et l'onglet « Sécurité » de chaque fiche tiennent les données dont le module HSSEQ a besoin pour autoriser ou refuser le départ d'un conducteur :</w:t>
+      </w:r>
+    </w:p>
+    <w:p>
+      <w:pPr>
+        <w:tabs>
+          <w:tab w:val="left" w:pos="360"/>
+        </w:tabs>
+        <w:spacing w:after="60"/>
+        <w:ind w:left="360" w:hanging="360"/>
+        <w:jc w:val="both"/>
+      </w:pPr>
+      <w:r>
+        <w:rPr>
+          <w:rFonts w:ascii="Calibri" w:cs="Calibri" w:eastAsia="Calibri" w:hAnsi="Calibri"/>
+          <w:b/>
+          <w:bCs/>
+          <w:color w:val="1A9E9E"/>
+          <w:sz w:val="20"/>
+          <w:szCs w:val="20"/>
+        </w:rPr>
+        <w:t xml:space="preserve">•	</w:t>
+      </w:r>
+      <w:r>
+        <w:rPr>
+          <w:rFonts w:ascii="Calibri" w:cs="Calibri" w:eastAsia="Calibri" w:hAnsi="Calibri"/>
+          <w:b/>
+          <w:bCs/>
+          <w:sz w:val="20"/>
+          <w:szCs w:val="20"/>
+        </w:rPr>
+        <w:t xml:space="preserve">Habilitations</w:t>
+      </w:r>
+      <w:r>
+        <w:rPr>
+          <w:rFonts w:ascii="Calibri" w:cs="Calibri" w:eastAsia="Calibri" w:hAnsi="Calibri"/>
+          <w:sz w:val="20"/>
+          <w:szCs w:val="20"/>
+        </w:rPr>
+        <w:t xml:space="preserve"> : permis poids lourd, conduite défensive, matières dangereuses, accès au site minier, secourisme (liste réglable dans les paramètres). Saisissez la date d'obtention : l'expiration est proposée selon la durée de validité du type. Joignez le justificatif.</w:t>
+      </w:r>
+    </w:p>
+    <w:p>
+      <w:pPr>
+        <w:tabs>
+          <w:tab w:val="left" w:pos="360"/>
+        </w:tabs>
+        <w:spacing w:after="60"/>
+        <w:ind w:left="360" w:hanging="360"/>
+        <w:jc w:val="both"/>
+      </w:pPr>
+      <w:r>
+        <w:rPr>
+          <w:rFonts w:ascii="Calibri" w:cs="Calibri" w:eastAsia="Calibri" w:hAnsi="Calibri"/>
+          <w:b/>
+          <w:bCs/>
+          <w:color w:val="1A9E9E"/>
+          <w:sz w:val="20"/>
+          <w:szCs w:val="20"/>
+        </w:rPr>
+        <w:t xml:space="preserve">•	</w:t>
+      </w:r>
+      <w:r>
+        <w:rPr>
+          <w:rFonts w:ascii="Calibri" w:cs="Calibri" w:eastAsia="Calibri" w:hAnsi="Calibri"/>
+          <w:b/>
+          <w:bCs/>
+          <w:sz w:val="20"/>
+          <w:szCs w:val="20"/>
+        </w:rPr>
+        <w:t xml:space="preserve">Aptitude médicale</w:t>
+      </w:r>
+      <w:r>
+        <w:rPr>
+          <w:rFonts w:ascii="Calibri" w:cs="Calibri" w:eastAsia="Calibri" w:hAnsi="Calibri"/>
+          <w:sz w:val="20"/>
+          <w:szCs w:val="20"/>
+        </w:rPr>
+        <w:t xml:space="preserve"> : seulement « apte » ou « inapte », la date de la visite et sa date de validité. N'enregistrez jamais de détail médical.</w:t>
+      </w:r>
+    </w:p>
+    <w:p>
+      <w:pPr>
+        <w:tabs>
+          <w:tab w:val="left" w:pos="360"/>
+        </w:tabs>
+        <w:spacing w:after="60"/>
+        <w:ind w:left="360" w:hanging="360"/>
+        <w:jc w:val="both"/>
+      </w:pPr>
+      <w:r>
+        <w:rPr>
+          <w:rFonts w:ascii="Calibri" w:cs="Calibri" w:eastAsia="Calibri" w:hAnsi="Calibri"/>
+          <w:b/>
+          <w:bCs/>
+          <w:color w:val="1A9E9E"/>
+          <w:sz w:val="20"/>
+          <w:szCs w:val="20"/>
+        </w:rPr>
+        <w:t xml:space="preserve">•	</w:t>
+      </w:r>
+      <w:r>
+        <w:rPr>
+          <w:rFonts w:ascii="Calibri" w:cs="Calibri" w:eastAsia="Calibri" w:hAnsi="Calibri"/>
+          <w:b/>
+          <w:bCs/>
+          <w:sz w:val="20"/>
+          <w:szCs w:val="20"/>
+        </w:rPr>
+        <w:t xml:space="preserve">EPI remis</w:t>
+      </w:r>
+      <w:r>
+        <w:rPr>
+          <w:rFonts w:ascii="Calibri" w:cs="Calibri" w:eastAsia="Calibri" w:hAnsi="Calibri"/>
+          <w:sz w:val="20"/>
+          <w:szCs w:val="20"/>
+        </w:rPr>
+        <w:t xml:space="preserve"> : casque, chaussures, gilet… avec la date de remise et celle du renouvellement.</w:t>
+      </w:r>
+    </w:p>
+    <w:p>
+      <w:pPr>
+        <w:tabs>
+          <w:tab w:val="left" w:pos="360"/>
+        </w:tabs>
+        <w:spacing w:after="60"/>
+        <w:ind w:left="360" w:hanging="360"/>
+        <w:jc w:val="both"/>
+      </w:pPr>
+      <w:r>
+        <w:rPr>
+          <w:rFonts w:ascii="Calibri" w:cs="Calibri" w:eastAsia="Calibri" w:hAnsi="Calibri"/>
+          <w:b/>
+          <w:bCs/>
+          <w:color w:val="1A9E9E"/>
+          <w:sz w:val="20"/>
+          <w:szCs w:val="20"/>
+        </w:rPr>
+        <w:t xml:space="preserve">•	</w:t>
+      </w:r>
+      <w:r>
+        <w:rPr>
+          <w:rFonts w:ascii="Calibri" w:cs="Calibri" w:eastAsia="Calibri" w:hAnsi="Calibri"/>
+          <w:b/>
+          <w:bCs/>
+          <w:sz w:val="20"/>
+          <w:szCs w:val="20"/>
+        </w:rPr>
+        <w:t xml:space="preserve">Accident du travail</w:t>
+      </w:r>
+      <w:r>
+        <w:rPr>
+          <w:rFonts w:ascii="Calibri" w:cs="Calibri" w:eastAsia="Calibri" w:hAnsi="Calibri"/>
+          <w:sz w:val="20"/>
+          <w:szCs w:val="20"/>
+        </w:rPr>
+        <w:t xml:space="preserve"> : saisissez l'arrêt avec le type d'absence « Accident du travail ». Il entre dans les taux de fréquence et de gravité, calculés sur les heures réellement travaillées.</w:t>
+      </w:r>
+    </w:p>
+    <w:p>
+      <w:pPr>
+        <w:spacing w:after="100"/>
+        <w:jc w:val="both"/>
+      </w:pPr>
+      <w:r>
+        <w:rPr>
+          <w:rFonts w:ascii="Calibri" w:cs="Calibri" w:eastAsia="Calibri" w:hAnsi="Calibri"/>
+          <w:sz w:val="20"/>
+          <w:szCs w:val="20"/>
+        </w:rPr>
+        <w:t xml:space="preserve">Un conducteur sans permis, conduite défensive ou habilitation aux matières dangereuses valide, ou dont l'aptitude est « inapte » ou dépassée, ne peut pas partir en rotation (motif V04 du verrou HSSEQ). La matrice le signale par « départ refusé ». L'échéancier prévient 30 jours puis 7 jours avant chaque expiration. Chaque conducteur voit ses habilitations dans « Mon espace ».</w:t>
+      </w:r>
+    </w:p>
+    <w:p>
+      <w:pPr>
+        <w:keepNext/>
+        <w:pBdr>
+          <w:bottom w:val="single" w:color="1A9E9E" w:sz="6" w:space="2"/>
+        </w:pBdr>
+        <w:spacing w:after="100" w:before="280"/>
+      </w:pPr>
+      <w:r>
+        <w:rPr>
+          <w:rFonts w:ascii="Calibri" w:cs="Calibri" w:eastAsia="Calibri" w:hAnsi="Calibri"/>
+          <w:b/>
+          <w:bCs/>
+          <w:color w:val="1C1E6B"/>
+          <w:sz w:val="26"/>
+          <w:szCs w:val="26"/>
+        </w:rPr>
         <w:t xml:space="preserve">Mon espace (tous les salariés)</w:t>
       </w:r>
     </w:p>

</xml_diff>

<commit_message>
RH : spécification et guide alignés sur le code (apte avec réserve, verrou V04, base des heures, saisie avant mise en service)
Co-Authored-By: Claude Opus 5.5 <noreply@anthropic.com>
</commit_message>
<xml_diff>
--- a/docs/guides/word/Guide_rh.docx
+++ b/docs/guides/word/Guide_rh.docx
@@ -11,7 +11,7 @@
           <wp:inline distT="0" distB="0" distL="0" distR="0">
             <wp:extent cx="1428750" cy="476250"/>
             <wp:effectExtent t="0" r="0" b="0" l="0"/>
-            <wp:docPr id="1" name="" descr="" title=""/>
+            <wp:docPr id="11" name="" descr="" title=""/>
             <wp:cNvGraphicFramePr>
               <a:graphicFrameLocks xmlns:a="http://schemas.openxmlformats.org/drawingml/2006/main" noChangeAspect="1"/>
             </wp:cNvGraphicFramePr>
@@ -2438,7 +2438,7 @@
           <w:sz w:val="20"/>
           <w:szCs w:val="20"/>
         </w:rPr>
-        <w:t xml:space="preserve"> : seulement « apte » ou « inapte », la date de la visite et sa date de validité. N'enregistrez jamais de détail médical.</w:t>
+        <w:t xml:space="preserve"> : seulement « apte », « apte avec réserve » ou « inapte », la date de la visite et sa date de validité. N'enregistrez jamais de détail médical, ni la nature d'une réserve.</w:t>
       </w:r>
     </w:p>
     <w:p>
@@ -2516,7 +2516,7 @@
           <w:sz w:val="20"/>
           <w:szCs w:val="20"/>
         </w:rPr>
-        <w:t xml:space="preserve"> : saisissez l'arrêt avec le type d'absence « Accident du travail ». Il entre dans les taux de fréquence et de gravité, calculés sur les heures réellement travaillées.</w:t>
+        <w:t xml:space="preserve"> : saisissez l'arrêt avec le type d'absence « Accident du travail ». Il entre dans les taux de fréquence et de gravité, calculés sur les heures payées par les bulletins validés (estimées par la présence pour un mois sans paie validée : l'écran l'indique).</w:t>
       </w:r>
     </w:p>
     <w:p>
@@ -2530,7 +2530,25 @@
           <w:sz w:val="20"/>
           <w:szCs w:val="20"/>
         </w:rPr>
-        <w:t xml:space="preserve">Un conducteur sans permis, conduite défensive ou habilitation aux matières dangereuses valide, ou dont l'aptitude est « inapte » ou dépassée, ne peut pas partir en rotation (motif V04 du verrou HSSEQ). La matrice le signale par « départ refusé ». L'échéancier prévient 30 jours puis 7 jours avant chaque expiration. Chaque conducteur voit ses habilitations dans « Mon espace ».</w:t>
+        <w:t xml:space="preserve">Un conducteur sans permis, conduite défensive ou habilitation aux matières dangereuses valide, ou dont l'aptitude est « inapte » ou dépassée, ne peut pas partir en rotation (motif V04 du verrou HSSEQ). La matrice le signale par « départ refusé ». Une aptitude non saisie ou avec réserve, ou une habilitation à renouveler, est signalée sans bloquer le départ. L'échéancier prévient 30 jours puis 7 jours avant chaque expiration (délais réglables dans les paramètres). Chaque conducteur voit ses habilitations dans « Mon espace ». </w:t>
+      </w:r>
+      <w:r>
+        <w:rPr>
+          <w:rFonts w:ascii="Calibri" w:cs="Calibri" w:eastAsia="Calibri" w:hAnsi="Calibri"/>
+          <w:b/>
+          <w:bCs/>
+          <w:sz w:val="20"/>
+          <w:szCs w:val="20"/>
+        </w:rPr>
+        <w:t xml:space="preserve">Saisissez les habilitations de tous les conducteurs avant la mise en service du verrou HSSEQ</w:t>
+      </w:r>
+      <w:r>
+        <w:rPr>
+          <w:rFonts w:ascii="Calibri" w:cs="Calibri" w:eastAsia="Calibri" w:hAnsi="Calibri"/>
+          <w:sz w:val="20"/>
+          <w:szCs w:val="20"/>
+        </w:rPr>
+        <w:t xml:space="preserve"> : sans elles, aucun départ n'est autorisé.</w:t>
       </w:r>
     </w:p>
     <w:p>

</xml_diff>

<commit_message>
RH : reprise des habilitations et des aptitudes par classeur (modèle prérempli, import tout ou rien, sans doublon au réimport)
Co-Authored-By: Claude Opus 5.5 <noreply@anthropic.com>
</commit_message>
<xml_diff>
--- a/docs/guides/word/Guide_rh.docx
+++ b/docs/guides/word/Guide_rh.docx
@@ -2553,6 +2553,20 @@
     </w:p>
     <w:p>
       <w:pPr>
+        <w:spacing w:after="100"/>
+        <w:jc w:val="both"/>
+      </w:pPr>
+      <w:r>
+        <w:rPr>
+          <w:rFonts w:ascii="Calibri" w:cs="Calibri" w:eastAsia="Calibri" w:hAnsi="Calibri"/>
+          <w:sz w:val="20"/>
+          <w:szCs w:val="20"/>
+        </w:rPr>
+        <w:t xml:space="preserve">Pour une première saisie en nombre, « Modèle de reprise » donne un classeur avec une rangée par conducteur et par habilitation, et une rangée d'aptitude par conducteur, déjà remplies de ce qui est connu. Complétez les dates (JJ/MM/AAAA), la référence et l'organisme, puis « Importer » : rien n'est enregistré tant qu'une rangée est en erreur, et chaque erreur est indiquée avec sa ligne. Réimporter le même classeur ne crée pas de doublon. Les justificatifs se déposent ensuite sur chaque fiche.</w:t>
+      </w:r>
+    </w:p>
+    <w:p>
+      <w:pPr>
         <w:keepNext/>
         <w:pBdr>
           <w:bottom w:val="single" w:color="1A9E9E" w:sz="6" w:space="2"/>

</xml_diff>